<commit_message>
Clarify checked slide answers and flag source annotation corrections
</commit_message>
<xml_diff>
--- a/notes/BBMS2006_Lecture2_English_Notes.docx
+++ b/notes/BBMS2006_Lecture2_English_Notes.docx
@@ -1710,7 +1710,7 @@
           <w:rFonts w:ascii="Noto Sans" w:hAnsi="Noto Sans" w:eastAsia="Noto Sans"/>
           <w:b w:val="0"/>
         </w:rPr>
-        <w:t>•  Precision: increasing Pgas raises dissolved concentration; it does not increase α at fixed temperature and medium.</w:t>
+        <w:t>•  Correction to slide wording: increasing Pgas raises dissolved concentration; it does not increase α at fixed temperature and medium.</w:t>
       </w:r>
     </w:p>
     <w:p>
@@ -2912,7 +2912,7 @@
         <w:drawing>
           <wp:inline xmlns:a="http://schemas.openxmlformats.org/drawingml/2006/main" xmlns:pic="http://schemas.openxmlformats.org/drawingml/2006/picture">
             <wp:extent cx="5400000" cy="2551648"/>
-            <wp:docPr id="5" name="Picture 5" descr="Original in-slide fill-in exercise, retaining the existing annotations (lecture p. 9).; original lecture figure, including visible annotations."/>
+            <wp:docPr id="5" name="Picture 5" descr="Answer check: the two entered answers, “thickness” and “diffusivity”, are correct (lecture p. 9).; original lecture figure, including visible annotations."/>
             <wp:cNvGraphicFramePr>
               <a:graphicFrameLocks noChangeAspect="1"/>
             </wp:cNvGraphicFramePr>
@@ -2949,7 +2949,7 @@
         <w:jc w:val="center"/>
       </w:pPr>
       <w:r>
-        <w:t>Original in-slide fill-in exercise, retaining the existing annotations (lecture p. 9).</w:t>
+        <w:t>Answer check: the two entered answers, “thickness” and “diffusivity”, are correct (lecture p. 9).</w:t>
       </w:r>
     </w:p>
     <w:tbl>
@@ -5067,7 +5067,7 @@
                 <w:color w:val="087F83"/>
                 <w:sz w:val="20"/>
               </w:rPr>
-              <w:t>Answers to the original P₅₀ fill-in prompts</w:t>
+              <w:t>Checked P₅₀ completions | The source lists options, not completed answers</w:t>
               <w:br/>
             </w:r>
             <w:r>
@@ -5142,7 +5142,7 @@
         <w:drawing>
           <wp:inline xmlns:a="http://schemas.openxmlformats.org/drawingml/2006/main" xmlns:pic="http://schemas.openxmlformats.org/drawingml/2006/picture">
             <wp:extent cx="5580000" cy="1532967"/>
-            <wp:docPr id="11" name="Picture 11" descr="Original right-shift factors and annotations (lecture p. 16); mechanism clarification below.; original lecture figure, including visible annotations."/>
+            <wp:docPr id="11" name="Picture 11" descr="Source retained for comparison: the BPG mechanism and HbF annotation need correction (lecture p. 16).; original lecture figure, including visible annotations."/>
             <wp:cNvGraphicFramePr>
               <a:graphicFrameLocks noChangeAspect="1"/>
             </wp:cNvGraphicFramePr>
@@ -5179,7 +5179,7 @@
         <w:jc w:val="center"/>
       </w:pPr>
       <w:r>
-        <w:t>Original right-shift factors and annotations (lecture p. 16); mechanism clarification below.</w:t>
+        <w:t>Source retained for comparison: the BPG mechanism and HbF annotation need correction (lecture p. 16).</w:t>
       </w:r>
     </w:p>
     <w:tbl>
@@ -5627,7 +5627,7 @@
                 <w:color w:val="17364D"/>
                 <w:sz w:val="20"/>
               </w:rPr>
-              <w:t>Keep the directions; distinguish the mechanisms</w:t>
+              <w:t>CORRECTION | Right-shift direction is correct; the BPG explanation is not</w:t>
               <w:br/>
             </w:r>
             <w:r>
@@ -6556,7 +6556,7 @@
         <w:drawing>
           <wp:inline xmlns:a="http://schemas.openxmlformats.org/drawingml/2006/main" xmlns:pic="http://schemas.openxmlformats.org/drawingml/2006/picture">
             <wp:extent cx="4068000" cy="2013741"/>
-            <wp:docPr id="12" name="Picture 12" descr="Original CO₂ transport forms, including the “kidney” annotation (lecture p. 17).; original lecture figure, including visible annotations."/>
+            <wp:docPr id="12" name="Picture 12" descr="Original CO₂ forms (lecture p. 17); “kidney” is a link to acid–base regulation, not the route of CO₂ elimination.; original lecture figure, including visible annotations."/>
             <wp:cNvGraphicFramePr>
               <a:graphicFrameLocks noChangeAspect="1"/>
             </wp:cNvGraphicFramePr>
@@ -6593,7 +6593,7 @@
         <w:jc w:val="center"/>
       </w:pPr>
       <w:r>
-        <w:t>Original CO₂ transport forms, including the “kidney” annotation (lecture p. 17).</w:t>
+        <w:t>Original CO₂ forms (lecture p. 17); “kidney” is a link to acid–base regulation, not the route of CO₂ elimination.</w:t>
       </w:r>
     </w:p>
     <w:tbl>
@@ -7426,7 +7426,7 @@
               </w:rPr>
               <w:t>At the same PCO₂, oxygenated blood carries less total CO₂ than deoxygenated blood. Explain why this does not contradict Henry’s law, and predict the pulmonary chloride shift.</w:t>
               <w:br/>
-              <w:t>Reasoning: Henry fixes only dissolved CO₂ when α and PCO₂ are fixed. Oxygenation reduces carbamino binding and releases H⁺, driving HCO₃⁻ towards CO₂; total CO₂ content can therefore fall (Haldane). In lungs, HCO₃⁻ enters RBCs while Cl⁻ leaves. A lower alveolar PCO₂ supports net elimination; oxygenation is not the pressure gradient itself.</w:t>
+              <w:t>Reasoning: Henry fixes only dissolved CO₂ at fixed α and PCO₂. Oxygenation releases CO₂ from Hb and H⁺ that converts HCO₃⁻ to CO₂. Total CO₂ falls only if CO₂ can leave while the blood re-equilibrates; conversion alone does not remove CO₂ from sealed blood. In lungs, HCO₃⁻ enters RBCs while Cl⁻ leaves; lower alveolar PCO₂ drives CO₂ out. Oxygenation facilitates release, not the pressure gradient itself.</w:t>
             </w:r>
           </w:p>
         </w:tc>

</xml_diff>